<commit_message>
Lab 5 final: integration notes, team inventory, consolidated diagram fixes, consistency check, report, Lab 3/4 sender address, file names
</commit_message>
<xml_diff>
--- a/Documents/COE420_Lab3_Team10.docx
+++ b/Documents/COE420_Lab3_Team10.docx
@@ -2004,10 +2004,10 @@
               <w:rPr>
                 <w:sz w:val="20"/>
               </w:rPr>
-              <w:t>Logged-in customer books a parcel with recipient and parcel details; reject incomplete or invalid submissions.</w:t>
-            </w:r>
-            <w:r>
-              <w:t xml:space="preserve"> </w:t>
+              <w:t xml:space="preserve">Logged-in customer books a parcel with the sender's pickup address and emirate, recipient details and parcel details; reject incomplete or invalid submissions. </w:t>
+            </w:r>
+            <w:r>
+              <w:t xml:space="preserve"/>
             </w:r>
           </w:p>
         </w:tc>
@@ -4968,7 +4968,7 @@
               <w:rPr>
                 <w:sz w:val="20"/>
               </w:rPr>
-              <w:t xml:space="preserve">Logged-in customer books a parcel with recipient details (full name, address, phone) and parcel details (weight &gt; 0 and ≤ 70 kg; length, width and height each &gt; 0 and ≤ 150 cm; description). The system rejects the booking if a required field is empty, the phone number is not a valid UAE number (+971 followed by 9 digits), or the weight or dimensions are outside these limits. On confirmation, the expected delivery window is shown: 24 hours from pickup if the recipient is in the same emirate as the sender, 48 hours if it is in a different emirate.</w:t>
+              <w:t xml:space="preserve">Logged-in customer books a parcel with the sender's pickup address and emirate, recipient details (full name, address, phone) and parcel details (weight &gt; 0 and ≤ 70 kg; length, width and height each &gt; 0 and ≤ 150 cm; description). The system rejects the booking if a required field is empty, the phone number is not a valid UAE number (+971 followed by 9 digits), or the weight or dimensions are outside these limits. On confirmation, the expected delivery window is shown: 24 hours from pickup if the recipient is in the same emirate as the sender, 48 hours if it is in a different emirate.</w:t>
             </w:r>
           </w:p>
         </w:tc>
@@ -13329,10 +13329,10 @@
               <w:rPr>
                 <w:sz w:val="20"/>
               </w:rPr>
-              <w:t>Logged-in customer enters recipient and parcel details to book delivery.</w:t>
-            </w:r>
-            <w:r>
-              <w:t xml:space="preserve"> </w:t>
+              <w:t xml:space="preserve">Logged-in customer enters the pickup address, recipient and parcel details to book delivery. </w:t>
+            </w:r>
+            <w:r>
+              <w:t xml:space="preserve"/>
             </w:r>
           </w:p>
         </w:tc>
@@ -19157,10 +19157,10 @@
               <w:rPr>
                 <w:sz w:val="20"/>
               </w:rPr>
-              <w:t>Enter recipient + parcel details to book delivery.</w:t>
-            </w:r>
-            <w:r>
-              <w:t xml:space="preserve"> </w:t>
+              <w:t xml:space="preserve">Enter pickup address, recipient + parcel details to book delivery. </w:t>
+            </w:r>
+            <w:r>
+              <w:t xml:space="preserve"/>
             </w:r>
           </w:p>
         </w:tc>

</xml_diff>